<commit_message>
Fix z-bar and superscript-n rendering in 9 papers (C7, C9, C10, C11)
tools/fix_math_accents.py: overline accent U+203E -> U+0305; text 'ⁿ' groups
-> Word superscript. Page size, page count, layout and margins unchanged.

Co-Authored-By: Claude Opus 5.5 <noreply@anthropic.com>
Claude-Session: https://claude.ai/code/session_01ABwg7zJ6HxiQEVye1MWpxq
</commit_message>
<xml_diff>
--- a/papers/class10_v3/AMO_C10_L1_PracticePaper4_v3.docx
+++ b/papers/class10_v3/AMO_C10_L1_PracticePaper4_v3.docx
@@ -24810,7 +24810,24 @@
                 <w:i w:val="0"/>
                 <w:sz w:val="20"/>
               </w:rPr>
-              <w:t>One ball of radius r gives 8 balls of radius r/2 (same volume). Each has 1/4 of the surface area, so the total is 8 × 1/4 = 2 times as much. After n rounds the total is 2ⁿ times, and 2⁴ = 16: 4 rounds.</w:t>
+              <w:t xml:space="preserve">One ball of radius r gives 8 balls of radius r/2 (same volume). Each has 1/4 of the surface area, so the total is 8 × 1/4 = 2 times as much. After n rounds the total is 2</w:t>
+            </w:r>
+            <w:r>
+              <w:rPr>
+                <w:b w:val="0"/>
+                <w:sz w:val="20"/>
+                <w:i/>
+                <w:vertAlign w:val="superscript"/>
+              </w:rPr>
+              <w:t>n</w:t>
+            </w:r>
+            <w:r>
+              <w:rPr>
+                <w:b w:val="0"/>
+                <w:i w:val="0"/>
+                <w:sz w:val="20"/>
+              </w:rPr>
+              <w:t xml:space="preserve"> times, and 2⁴ = 16: 4 rounds.</w:t>
             </w:r>
           </w:p>
         </w:tc>

</xml_diff>